<commit_message>
Manual de instalación - FINAL
</commit_message>
<xml_diff>
--- a/DOCS/Manual de instalacion.docx
+++ b/DOCS/Manual de instalacion.docx
@@ -1407,6 +1407,7 @@
             <w:pStyle w:val="TDC2"/>
             <w:rPr>
               <w:rFonts w:eastAsiaTheme="minorEastAsia"/>
+              <w:color w:val="767171" w:themeColor="background2" w:themeShade="80"/>
               <w:sz w:val="24"/>
               <w:szCs w:val="24"/>
               <w:lang w:eastAsia="es-ES"/>
@@ -1418,7 +1419,7 @@
                 <w:rStyle w:val="Hipervnculo"/>
                 <w:i w:val="0"/>
                 <w:iCs w:val="0"/>
-                <w:color w:val="auto"/>
+                <w:color w:val="767171" w:themeColor="background2" w:themeShade="80"/>
                 <w:sz w:val="24"/>
                 <w:szCs w:val="24"/>
               </w:rPr>
@@ -1427,7 +1428,7 @@
             <w:r>
               <w:rPr>
                 <w:rStyle w:val="Hipervnculo"/>
-                <w:color w:val="auto"/>
+                <w:color w:val="767171" w:themeColor="background2" w:themeShade="80"/>
                 <w:sz w:val="24"/>
                 <w:szCs w:val="24"/>
               </w:rPr>
@@ -1507,6 +1508,7 @@
             <w:pStyle w:val="TDC2"/>
             <w:rPr>
               <w:rFonts w:eastAsiaTheme="minorEastAsia"/>
+              <w:color w:val="767171" w:themeColor="background2" w:themeShade="80"/>
               <w:sz w:val="24"/>
               <w:szCs w:val="24"/>
               <w:lang w:eastAsia="es-ES"/>
@@ -1516,7 +1518,7 @@
             <w:r>
               <w:rPr>
                 <w:rStyle w:val="Hipervnculo"/>
-                <w:color w:val="auto"/>
+                <w:color w:val="767171" w:themeColor="background2" w:themeShade="80"/>
                 <w:sz w:val="24"/>
                 <w:szCs w:val="24"/>
               </w:rPr>
@@ -1525,6 +1527,7 @@
             <w:r>
               <w:rPr>
                 <w:rFonts w:eastAsiaTheme="minorEastAsia"/>
+                <w:color w:val="767171" w:themeColor="background2" w:themeShade="80"/>
                 <w:sz w:val="24"/>
                 <w:szCs w:val="24"/>
                 <w:lang w:eastAsia="es-ES"/>
@@ -1534,7 +1537,7 @@
             <w:r>
               <w:rPr>
                 <w:rStyle w:val="Hipervnculo"/>
-                <w:color w:val="auto"/>
+                <w:color w:val="767171" w:themeColor="background2" w:themeShade="80"/>
                 <w:sz w:val="24"/>
                 <w:szCs w:val="24"/>
               </w:rPr>
@@ -1810,7 +1813,27 @@
                 <w:sz w:val="24"/>
                 <w:szCs w:val="24"/>
               </w:rPr>
-              <w:t>8. SOLUCIÓN DE PROBLEMAS COMUNES (FAQ)</w:t>
+              <w:t>8. SOLUCIÓN DE PROBLEMA</w:t>
+            </w:r>
+            <w:r>
+              <w:rPr>
+                <w:rStyle w:val="Hipervnculo"/>
+                <w:rFonts w:ascii="Candara" w:hAnsi="Candara"/>
+                <w:noProof/>
+                <w:sz w:val="24"/>
+                <w:szCs w:val="24"/>
+              </w:rPr>
+              <w:t>S</w:t>
+            </w:r>
+            <w:r>
+              <w:rPr>
+                <w:rStyle w:val="Hipervnculo"/>
+                <w:rFonts w:ascii="Candara" w:hAnsi="Candara"/>
+                <w:noProof/>
+                <w:sz w:val="24"/>
+                <w:szCs w:val="24"/>
+              </w:rPr>
+              <w:t xml:space="preserve"> COMUNES (FAQ)</w:t>
             </w:r>
             <w:r>
               <w:rPr>
@@ -3713,6 +3736,9 @@
       <w:pPr>
         <w:pStyle w:val="NormalWeb"/>
         <w:spacing w:line="276" w:lineRule="auto"/>
+        <w:rPr>
+          <w:rFonts w:ascii="Corbel" w:hAnsi="Corbel"/>
+        </w:rPr>
       </w:pPr>
     </w:p>
     <w:p/>
@@ -5939,6 +5965,7 @@
         </w:numPr>
         <w:spacing w:after="0" w:afterAutospacing="0"/>
         <w:ind w:left="284" w:hanging="294"/>
+        <w:jc w:val="both"/>
         <w:rPr>
           <w:rFonts w:ascii="Corbel" w:hAnsi="Corbel"/>
         </w:rPr>
@@ -6064,6 +6091,7 @@
         <w:pStyle w:val="NormalWeb"/>
         <w:spacing w:before="0" w:beforeAutospacing="0" w:after="0" w:afterAutospacing="0"/>
         <w:ind w:left="284"/>
+        <w:jc w:val="both"/>
         <w:rPr>
           <w:rFonts w:ascii="Corbel" w:hAnsi="Corbel"/>
           <w:sz w:val="10"/>
@@ -6080,6 +6108,7 @@
         </w:numPr>
         <w:spacing w:before="0" w:beforeAutospacing="0" w:after="0" w:afterAutospacing="0"/>
         <w:ind w:left="284" w:hanging="294"/>
+        <w:jc w:val="both"/>
         <w:rPr>
           <w:rFonts w:ascii="Corbel" w:hAnsi="Corbel"/>
         </w:rPr>
@@ -6096,6 +6125,7 @@
         <w:pStyle w:val="NormalWeb"/>
         <w:spacing w:before="0" w:beforeAutospacing="0" w:after="0" w:afterAutospacing="0"/>
         <w:ind w:left="284"/>
+        <w:jc w:val="both"/>
         <w:rPr>
           <w:rFonts w:ascii="Corbel" w:hAnsi="Corbel"/>
           <w:sz w:val="10"/>
@@ -6112,6 +6142,7 @@
         </w:numPr>
         <w:spacing w:before="0" w:beforeAutospacing="0" w:after="0" w:afterAutospacing="0"/>
         <w:ind w:left="284" w:hanging="294"/>
+        <w:jc w:val="both"/>
         <w:rPr>
           <w:rFonts w:ascii="Corbel" w:hAnsi="Corbel"/>
         </w:rPr>
@@ -6127,6 +6158,7 @@
       <w:pPr>
         <w:pStyle w:val="NormalWeb"/>
         <w:spacing w:before="0" w:beforeAutospacing="0" w:after="0" w:afterAutospacing="0"/>
+        <w:jc w:val="both"/>
         <w:rPr>
           <w:rFonts w:ascii="Corbel" w:hAnsi="Corbel"/>
           <w:sz w:val="10"/>
@@ -6141,7 +6173,9 @@
           <w:ilvl w:val="0"/>
           <w:numId w:val="23"/>
         </w:numPr>
+        <w:spacing w:before="0" w:beforeAutospacing="0"/>
         <w:ind w:left="284" w:hanging="294"/>
+        <w:jc w:val="both"/>
         <w:rPr>
           <w:rFonts w:ascii="Corbel" w:hAnsi="Corbel"/>
         </w:rPr>

</xml_diff>

<commit_message>
Manual de instalación - VER. FINAL
Se ha implementado el logotipo en la portada y en los encabezados del resto de páginas. Además se ha añadido un eslogan.
</commit_message>
<xml_diff>
--- a/DOCS/Manual de instalacion.docx
+++ b/DOCS/Manual de instalacion.docx
@@ -39,6 +39,67 @@
               <w:lang w:eastAsia="es-ES"/>
             </w:rPr>
           </w:pPr>
+          <w:r>
+            <w:rPr>
+              <w:noProof/>
+              <w:color w:val="4472C4" w:themeColor="accent1"/>
+            </w:rPr>
+            <w:drawing>
+              <wp:anchor distT="0" distB="0" distL="114300" distR="114300" simplePos="0" relativeHeight="251679744" behindDoc="0" locked="0" layoutInCell="1" allowOverlap="1" wp14:anchorId="0D031A56" wp14:editId="565F5D9F">
+                <wp:simplePos x="0" y="0"/>
+                <wp:positionH relativeFrom="margin">
+                  <wp:posOffset>3264304</wp:posOffset>
+                </wp:positionH>
+                <wp:positionV relativeFrom="paragraph">
+                  <wp:posOffset>381635</wp:posOffset>
+                </wp:positionV>
+                <wp:extent cx="2286000" cy="1535339"/>
+                <wp:effectExtent l="0" t="0" r="0" b="0"/>
+                <wp:wrapNone/>
+                <wp:docPr id="14" name="Imagen 14"/>
+                <wp:cNvGraphicFramePr>
+                  <a:graphicFrameLocks xmlns:a="http://schemas.openxmlformats.org/drawingml/2006/main" noChangeAspect="1"/>
+                </wp:cNvGraphicFramePr>
+                <a:graphic xmlns:a="http://schemas.openxmlformats.org/drawingml/2006/main">
+                  <a:graphicData uri="http://schemas.openxmlformats.org/drawingml/2006/picture">
+                    <pic:pic xmlns:pic="http://schemas.openxmlformats.org/drawingml/2006/picture">
+                      <pic:nvPicPr>
+                        <pic:cNvPr id="14" name="Imagen 14"/>
+                        <pic:cNvPicPr/>
+                      </pic:nvPicPr>
+                      <pic:blipFill>
+                        <a:blip r:embed="rId8" cstate="print">
+                          <a:extLst>
+                            <a:ext uri="{28A0092B-C50C-407E-A947-70E740481C1C}">
+                              <a14:useLocalDpi xmlns:a14="http://schemas.microsoft.com/office/drawing/2010/main" val="0"/>
+                            </a:ext>
+                          </a:extLst>
+                        </a:blip>
+                        <a:stretch>
+                          <a:fillRect/>
+                        </a:stretch>
+                      </pic:blipFill>
+                      <pic:spPr>
+                        <a:xfrm>
+                          <a:off x="0" y="0"/>
+                          <a:ext cx="2286000" cy="1535339"/>
+                        </a:xfrm>
+                        <a:prstGeom prst="rect">
+                          <a:avLst/>
+                        </a:prstGeom>
+                      </pic:spPr>
+                    </pic:pic>
+                  </a:graphicData>
+                </a:graphic>
+                <wp14:sizeRelH relativeFrom="margin">
+                  <wp14:pctWidth>0</wp14:pctWidth>
+                </wp14:sizeRelH>
+                <wp14:sizeRelV relativeFrom="margin">
+                  <wp14:pctHeight>0</wp14:pctHeight>
+                </wp14:sizeRelV>
+              </wp:anchor>
+            </w:drawing>
+          </w:r>
           <w:r>
             <w:rPr>
               <w:noProof/>
@@ -1813,27 +1874,7 @@
                 <w:sz w:val="24"/>
                 <w:szCs w:val="24"/>
               </w:rPr>
-              <w:t>8. SOLUCIÓN DE PROBLEMA</w:t>
-            </w:r>
-            <w:r>
-              <w:rPr>
-                <w:rStyle w:val="Hipervnculo"/>
-                <w:rFonts w:ascii="Candara" w:hAnsi="Candara"/>
-                <w:noProof/>
-                <w:sz w:val="24"/>
-                <w:szCs w:val="24"/>
-              </w:rPr>
-              <w:t>S</w:t>
-            </w:r>
-            <w:r>
-              <w:rPr>
-                <w:rStyle w:val="Hipervnculo"/>
-                <w:rFonts w:ascii="Candara" w:hAnsi="Candara"/>
-                <w:noProof/>
-                <w:sz w:val="24"/>
-                <w:szCs w:val="24"/>
-              </w:rPr>
-              <w:t xml:space="preserve"> COMUNES (FAQ)</w:t>
+              <w:t>8. SOLUCIÓN DE PROBLEMAS COMUNES (FAQ)</w:t>
             </w:r>
             <w:r>
               <w:rPr>
@@ -2022,7 +2063,7 @@
                     </pic:cNvPicPr>
                   </pic:nvPicPr>
                   <pic:blipFill>
-                    <a:blip r:embed="rId8" cstate="print">
+                    <a:blip r:embed="rId9" cstate="print">
                       <a:extLst>
                         <a:ext uri="{28A0092B-C50C-407E-A947-70E740481C1C}">
                           <a14:useLocalDpi xmlns:a14="http://schemas.microsoft.com/office/drawing/2010/main" val="0"/>
@@ -2691,7 +2732,7 @@
                     </pic:cNvPicPr>
                   </pic:nvPicPr>
                   <pic:blipFill>
-                    <a:blip r:embed="rId9" cstate="print">
+                    <a:blip r:embed="rId10" cstate="print">
                       <a:extLst>
                         <a:ext uri="{28A0092B-C50C-407E-A947-70E740481C1C}">
                           <a14:useLocalDpi xmlns:a14="http://schemas.microsoft.com/office/drawing/2010/main" val="0"/>
@@ -3787,7 +3828,7 @@
                     </pic:cNvPicPr>
                   </pic:nvPicPr>
                   <pic:blipFill>
-                    <a:blip r:embed="rId10" cstate="print">
+                    <a:blip r:embed="rId11" cstate="print">
                       <a:extLst>
                         <a:ext uri="{28A0092B-C50C-407E-A947-70E740481C1C}">
                           <a14:useLocalDpi xmlns:a14="http://schemas.microsoft.com/office/drawing/2010/main" val="0"/>
@@ -4096,7 +4137,7 @@
         </w:rPr>
         <w:t xml:space="preserve">Abra su navegador y escriba la dirección: </w:t>
       </w:r>
-      <w:hyperlink r:id="rId11" w:history="1">
+      <w:hyperlink r:id="rId12" w:history="1">
         <w:r>
           <w:rPr>
             <w:rStyle w:val="Hipervnculo"/>
@@ -4807,7 +4848,7 @@
                     </pic:cNvPicPr>
                   </pic:nvPicPr>
                   <pic:blipFill>
-                    <a:blip r:embed="rId12" cstate="print">
+                    <a:blip r:embed="rId13" cstate="print">
                       <a:extLst>
                         <a:ext uri="{28A0092B-C50C-407E-A947-70E740481C1C}">
                           <a14:useLocalDpi xmlns:a14="http://schemas.microsoft.com/office/drawing/2010/main" val="0"/>
@@ -5211,7 +5252,7 @@
                     </pic:cNvPicPr>
                   </pic:nvPicPr>
                   <pic:blipFill>
-                    <a:blip r:embed="rId13" cstate="print">
+                    <a:blip r:embed="rId14" cstate="print">
                       <a:extLst>
                         <a:ext uri="{28A0092B-C50C-407E-A947-70E740481C1C}">
                           <a14:useLocalDpi xmlns:a14="http://schemas.microsoft.com/office/drawing/2010/main" val="0"/>
@@ -5446,7 +5487,7 @@
                     </pic:cNvPicPr>
                   </pic:nvPicPr>
                   <pic:blipFill>
-                    <a:blip r:embed="rId14" cstate="print">
+                    <a:blip r:embed="rId15" cstate="print">
                       <a:extLst>
                         <a:ext uri="{28A0092B-C50C-407E-A947-70E740481C1C}">
                           <a14:useLocalDpi xmlns:a14="http://schemas.microsoft.com/office/drawing/2010/main" val="0"/>
@@ -5703,7 +5744,7 @@
         </w:rPr>
         <w:t xml:space="preserve">Escriba en la barra de direcciones: </w:t>
       </w:r>
-      <w:hyperlink r:id="rId15" w:history="1">
+      <w:hyperlink r:id="rId16" w:history="1">
         <w:r>
           <w:rPr>
             <w:rStyle w:val="Hipervnculo"/>
@@ -6226,7 +6267,8 @@
       </w:pPr>
     </w:p>
     <w:sectPr>
-      <w:footerReference w:type="default" r:id="rId16"/>
+      <w:headerReference w:type="default" r:id="rId17"/>
+      <w:footerReference w:type="default" r:id="rId18"/>
       <w:pgSz w:w="11906" w:h="16838"/>
       <w:pgMar w:top="1276" w:right="1416" w:bottom="1560" w:left="1418" w:header="708" w:footer="510" w:gutter="0"/>
       <w:pgNumType w:start="0"/>
@@ -6271,103 +6313,77 @@
       <w:jc w:val="center"/>
       <w:rPr>
         <w:rFonts w:ascii="Cascadia Code Light" w:hAnsi="Cascadia Code Light" w:cs="Cascadia Code Light"/>
-        <w:sz w:val="24"/>
-        <w:szCs w:val="24"/>
       </w:rPr>
     </w:pPr>
     <w:r>
       <w:rPr>
         <w:rFonts w:ascii="Cascadia Code Light" w:hAnsi="Cascadia Code Light" w:cs="Cascadia Code Light"/>
-        <w:sz w:val="24"/>
-        <w:szCs w:val="24"/>
       </w:rPr>
       <w:t xml:space="preserve">Página </w:t>
     </w:r>
     <w:r>
       <w:rPr>
         <w:rFonts w:ascii="Cascadia Code Light" w:hAnsi="Cascadia Code Light" w:cs="Cascadia Code Light"/>
-        <w:sz w:val="24"/>
-        <w:szCs w:val="24"/>
       </w:rPr>
       <w:fldChar w:fldCharType="begin"/>
     </w:r>
     <w:r>
       <w:rPr>
         <w:rFonts w:ascii="Cascadia Code Light" w:hAnsi="Cascadia Code Light" w:cs="Cascadia Code Light"/>
-        <w:sz w:val="24"/>
-        <w:szCs w:val="24"/>
       </w:rPr>
       <w:instrText>PAGE  \* Arabic  \* MERGEFORMAT</w:instrText>
     </w:r>
     <w:r>
       <w:rPr>
         <w:rFonts w:ascii="Cascadia Code Light" w:hAnsi="Cascadia Code Light" w:cs="Cascadia Code Light"/>
-        <w:sz w:val="24"/>
-        <w:szCs w:val="24"/>
       </w:rPr>
       <w:fldChar w:fldCharType="separate"/>
     </w:r>
     <w:r>
       <w:rPr>
         <w:rFonts w:ascii="Cascadia Code Light" w:hAnsi="Cascadia Code Light" w:cs="Cascadia Code Light"/>
-        <w:sz w:val="24"/>
-        <w:szCs w:val="24"/>
       </w:rPr>
       <w:t>2</w:t>
     </w:r>
     <w:r>
       <w:rPr>
         <w:rFonts w:ascii="Cascadia Code Light" w:hAnsi="Cascadia Code Light" w:cs="Cascadia Code Light"/>
-        <w:sz w:val="24"/>
-        <w:szCs w:val="24"/>
       </w:rPr>
       <w:fldChar w:fldCharType="end"/>
     </w:r>
     <w:r>
       <w:rPr>
         <w:rFonts w:ascii="Cascadia Code Light" w:hAnsi="Cascadia Code Light" w:cs="Cascadia Code Light"/>
-        <w:sz w:val="24"/>
-        <w:szCs w:val="24"/>
       </w:rPr>
       <w:t xml:space="preserve"> de </w:t>
     </w:r>
     <w:r>
       <w:rPr>
         <w:rFonts w:ascii="Cascadia Code Light" w:hAnsi="Cascadia Code Light" w:cs="Cascadia Code Light"/>
-        <w:sz w:val="24"/>
-        <w:szCs w:val="24"/>
       </w:rPr>
       <w:fldChar w:fldCharType="begin"/>
     </w:r>
     <w:r>
       <w:rPr>
         <w:rFonts w:ascii="Cascadia Code Light" w:hAnsi="Cascadia Code Light" w:cs="Cascadia Code Light"/>
-        <w:sz w:val="24"/>
-        <w:szCs w:val="24"/>
       </w:rPr>
       <w:instrText>NUMPAGES  \* Arabic  \* MERGEFORMAT</w:instrText>
     </w:r>
     <w:r>
       <w:rPr>
         <w:rFonts w:ascii="Cascadia Code Light" w:hAnsi="Cascadia Code Light" w:cs="Cascadia Code Light"/>
-        <w:sz w:val="24"/>
-        <w:szCs w:val="24"/>
       </w:rPr>
       <w:fldChar w:fldCharType="separate"/>
     </w:r>
     <w:r>
       <w:rPr>
         <w:rFonts w:ascii="Cascadia Code Light" w:hAnsi="Cascadia Code Light" w:cs="Cascadia Code Light"/>
-        <w:sz w:val="24"/>
-        <w:szCs w:val="24"/>
       </w:rPr>
       <w:t>2</w:t>
     </w:r>
     <w:r>
       <w:rPr>
         <w:rFonts w:ascii="Cascadia Code Light" w:hAnsi="Cascadia Code Light" w:cs="Cascadia Code Light"/>
-        <w:sz w:val="24"/>
-        <w:szCs w:val="24"/>
       </w:rPr>
       <w:fldChar w:fldCharType="end"/>
     </w:r>
@@ -6398,6 +6414,140 @@
     </w:p>
   </w:footnote>
 </w:footnotes>
+</file>
+
+<file path=word/header1.xml><?xml version="1.0" encoding="utf-8"?>
+<w:hdr xmlns:wpc="http://schemas.microsoft.com/office/word/2010/wordprocessingCanvas" xmlns:cx="http://schemas.microsoft.com/office/drawing/2014/chartex" xmlns:cx1="http://schemas.microsoft.com/office/drawing/2015/9/8/chartex" xmlns:cx2="http://schemas.microsoft.com/office/drawing/2015/10/21/chartex" xmlns:cx3="http://schemas.microsoft.com/office/drawing/2016/5/9/chartex" xmlns:cx4="http://schemas.microsoft.com/office/drawing/2016/5/10/chartex" xmlns:cx5="http://schemas.microsoft.com/office/drawing/2016/5/11/chartex" xmlns:cx6="http://schemas.microsoft.com/office/drawing/2016/5/12/chartex" xmlns:cx7="http://schemas.microsoft.com/office/drawing/2016/5/13/chartex" xmlns:cx8="http://schemas.microsoft.com/office/drawing/2016/5/14/chartex" xmlns:mc="http://schemas.openxmlformats.org/markup-compatibility/2006" xmlns:aink="http://schemas.microsoft.com/office/drawing/2016/ink" xmlns:am3d="http://schemas.microsoft.com/office/drawing/2017/model3d" xmlns:o="urn:schemas-microsoft-com:office:office" xmlns:r="http://schemas.openxmlformats.org/officeDocument/2006/relationships" xmlns:m="http://schemas.openxmlformats.org/officeDocument/2006/math" xmlns:v="urn:schemas-microsoft-com:vml" xmlns:wp14="http://schemas.microsoft.com/office/word/2010/wordprocessingDrawing" xmlns:wp="http://schemas.openxmlformats.org/drawingml/2006/wordprocessingDrawing" xmlns:w10="urn:schemas-microsoft-com:office:word" xmlns:w="http://schemas.openxmlformats.org/wordprocessingml/2006/main" xmlns:w14="http://schemas.microsoft.com/office/word/2010/wordml" xmlns:w15="http://schemas.microsoft.com/office/word/2012/wordml" xmlns:w16cex="http://schemas.microsoft.com/office/word/2018/wordml/cex" xmlns:w16cid="http://schemas.microsoft.com/office/word/2016/wordml/cid" xmlns:w16="http://schemas.microsoft.com/office/word/2018/wordml" xmlns:w16sdtdh="http://schemas.microsoft.com/office/word/2020/wordml/sdtdatahash" xmlns:w16se="http://schemas.microsoft.com/office/word/2015/wordml/symex" xmlns:wpg="http://schemas.microsoft.com/office/word/2010/wordprocessingGroup" xmlns:wpi="http://schemas.microsoft.com/office/word/2010/wordprocessingInk" xmlns:wne="http://schemas.microsoft.com/office/word/2006/wordml" xmlns:wps="http://schemas.microsoft.com/office/word/2010/wordprocessingShape" mc:Ignorable="w14 w15 w16se w16cid w16 w16cex w16sdtdh wp14">
+  <w:p>
+    <w:pPr>
+      <w:pStyle w:val="Encabezado"/>
+      <w:rPr>
+        <w:b/>
+        <w:bCs/>
+        <w:color w:val="3BB3BD"/>
+      </w:rPr>
+    </w:pPr>
+    <w:r>
+      <w:rPr>
+        <w:rFonts w:ascii="Corbel" w:hAnsi="Corbel"/>
+        <w:noProof/>
+      </w:rPr>
+      <w:drawing>
+        <wp:anchor distT="0" distB="0" distL="114300" distR="114300" simplePos="0" relativeHeight="251660288" behindDoc="1" locked="0" layoutInCell="1" allowOverlap="1" wp14:anchorId="3CD305AD" wp14:editId="068D9418">
+          <wp:simplePos x="0" y="0"/>
+          <wp:positionH relativeFrom="column">
+            <wp:posOffset>-189230</wp:posOffset>
+          </wp:positionH>
+          <wp:positionV relativeFrom="paragraph">
+            <wp:posOffset>-104140</wp:posOffset>
+          </wp:positionV>
+          <wp:extent cx="508870" cy="380333"/>
+          <wp:effectExtent l="0" t="0" r="5715" b="1270"/>
+          <wp:wrapNone/>
+          <wp:docPr id="16" name="Imagen 16"/>
+          <wp:cNvGraphicFramePr>
+            <a:graphicFrameLocks xmlns:a="http://schemas.openxmlformats.org/drawingml/2006/main" noChangeAspect="1"/>
+          </wp:cNvGraphicFramePr>
+          <a:graphic xmlns:a="http://schemas.openxmlformats.org/drawingml/2006/main">
+            <a:graphicData uri="http://schemas.openxmlformats.org/drawingml/2006/picture">
+              <pic:pic xmlns:pic="http://schemas.openxmlformats.org/drawingml/2006/picture">
+                <pic:nvPicPr>
+                  <pic:cNvPr id="15" name="Imagen 15"/>
+                  <pic:cNvPicPr/>
+                </pic:nvPicPr>
+                <pic:blipFill rotWithShape="1">
+                  <a:blip r:embed="rId1">
+                    <a:extLst>
+                      <a:ext uri="{28A0092B-C50C-407E-A947-70E740481C1C}">
+                        <a14:useLocalDpi xmlns:a14="http://schemas.microsoft.com/office/drawing/2010/main" val="0"/>
+                      </a:ext>
+                    </a:extLst>
+                  </a:blip>
+                  <a:srcRect l="17544" t="10726" r="15009" b="14218"/>
+                  <a:stretch/>
+                </pic:blipFill>
+                <pic:spPr bwMode="auto">
+                  <a:xfrm>
+                    <a:off x="0" y="0"/>
+                    <a:ext cx="508870" cy="380333"/>
+                  </a:xfrm>
+                  <a:prstGeom prst="rect">
+                    <a:avLst/>
+                  </a:prstGeom>
+                  <a:ln>
+                    <a:noFill/>
+                  </a:ln>
+                  <a:extLst>
+                    <a:ext uri="{53640926-AAD7-44D8-BBD7-CCE9431645EC}">
+                      <a14:shadowObscured xmlns:a14="http://schemas.microsoft.com/office/drawing/2010/main"/>
+                    </a:ext>
+                  </a:extLst>
+                </pic:spPr>
+              </pic:pic>
+            </a:graphicData>
+          </a:graphic>
+          <wp14:sizeRelH relativeFrom="margin">
+            <wp14:pctWidth>0</wp14:pctWidth>
+          </wp14:sizeRelH>
+          <wp14:sizeRelV relativeFrom="margin">
+            <wp14:pctHeight>0</wp14:pctHeight>
+          </wp14:sizeRelV>
+        </wp:anchor>
+      </w:drawing>
+    </w:r>
+    <w:r>
+      <w:rPr>
+        <w:rFonts w:ascii="Corbel" w:hAnsi="Corbel"/>
+      </w:rPr>
+      <w:t xml:space="preserve">           </w:t>
+    </w:r>
+    <w:r>
+      <w:rPr>
+        <w:rFonts w:ascii="Corbel" w:hAnsi="Corbel"/>
+      </w:rPr>
+      <w:t xml:space="preserve">  </w:t>
+    </w:r>
+    <w:r>
+      <w:rPr>
+        <w:rFonts w:ascii="Corbel" w:hAnsi="Corbel"/>
+        <w:b/>
+        <w:bCs/>
+        <w:color w:val="21263B"/>
+        <w:sz w:val="20"/>
+        <w:szCs w:val="20"/>
+      </w:rPr>
+      <w:t xml:space="preserve">Conecta, aprende y aprueba. Así de </w:t>
+    </w:r>
+    <w:proofErr w:type="spellStart"/>
+    <w:r>
+      <w:rPr>
+        <w:rFonts w:ascii="Corbel" w:hAnsi="Corbel"/>
+        <w:b/>
+        <w:bCs/>
+        <w:color w:val="21263B"/>
+        <w:sz w:val="20"/>
+        <w:szCs w:val="20"/>
+      </w:rPr>
+      <w:t>isi</w:t>
+    </w:r>
+    <w:proofErr w:type="spellEnd"/>
+    <w:r>
+      <w:rPr>
+        <w:b/>
+        <w:bCs/>
+        <w:color w:val="21263B"/>
+        <w:sz w:val="20"/>
+        <w:szCs w:val="20"/>
+      </w:rPr>
+      <w:t>.</w:t>
+    </w:r>
+  </w:p>
+  <w:p>
+    <w:pPr>
+      <w:pStyle w:val="Encabezado"/>
+    </w:pPr>
+  </w:p>
+</w:hdr>
 </file>
 
 <file path=word/numbering.xml><?xml version="1.0" encoding="utf-8"?>

</xml_diff>